<commit_message>
Cambios en el template del docx para que se observen correctamente los principios
</commit_message>
<xml_diff>
--- a/src/templates/pum-template.docx
+++ b/src/templates/pum-template.docx
@@ -1984,7 +1984,14 @@
                 <w:rFonts w:ascii="Century Gothic" w:hAnsi="Century Gothic" w:cs="Times New Roman"/>
                 <w:color w:val="000000" w:themeColor="text1"/>
               </w:rPr>
-              <w:t>: Proporcionar múltiples formas de compromiso</w:t>
+              <w:t xml:space="preserve">: </w:t>
+            </w:r>
+            <w:r>
+              <w:rPr>
+                <w:rFonts w:ascii="Century Gothic" w:hAnsi="Century Gothic" w:cs="Times New Roman"/>
+                <w:color w:val="000000" w:themeColor="text1"/>
+              </w:rPr>
+              <w:t>PROVEER MÚLTIPLES FORMAS DE REPRESENTACIÓN</w:t>
             </w:r>
           </w:p>
         </w:tc>
@@ -2066,14 +2073,7 @@
                 <w:rFonts w:ascii="Century Gothic" w:hAnsi="Century Gothic" w:cs="Times New Roman"/>
                 <w:lang w:val="es-EC"/>
               </w:rPr>
-              <w:t>P</w:t>
-            </w:r>
-            <w:r>
-              <w:rPr>
-                <w:rFonts w:ascii="Century Gothic" w:hAnsi="Century Gothic" w:cs="Times New Roman"/>
-                <w:lang w:val="es-EC"/>
-              </w:rPr>
-              <w:t>roporcionar múltiples formas de representación</w:t>
+              <w:t>OFRECER MÚLTIPLES MEDIOS PARA LA ACCIÓN Y EXPRESIÓN</w:t>
             </w:r>
           </w:p>
         </w:tc>
@@ -2156,14 +2156,7 @@
                 <w:rFonts w:ascii="Century Gothic" w:hAnsi="Century Gothic" w:cs="Times New Roman"/>
                 <w:color w:val="000000" w:themeColor="text1"/>
               </w:rPr>
-              <w:t>P</w:t>
-            </w:r>
-            <w:r>
-              <w:rPr>
-                <w:rFonts w:ascii="Century Gothic" w:hAnsi="Century Gothic" w:cs="Times New Roman"/>
-                <w:color w:val="000000" w:themeColor="text1"/>
-              </w:rPr>
-              <w:t>roporcionar múltiples formas de acción y representación</w:t>
+              <w:t>PROPORCIONAR MÚLTIPLES MEDIOS PARA LA MOTIVACIÓN E IMPLICACIÓN EN EL APRENDIZAJE</w:t>
             </w:r>
           </w:p>
         </w:tc>
@@ -2428,8 +2421,8 @@
         <v:path o:extrusionok="f" gradientshapeok="t" o:connecttype="rect"/>
         <o:lock v:ext="edit" aspectratio="t"/>
       </v:shapetype>
-      <v:shape id="_x0000_i1064" type="#_x0000_t75" style="width:44.25pt;height:35.25pt" o:bullet="t">
-        <v:imagedata r:id="rId1" o:title="Captura de pantalla 2026-06-03 a la(s) 11.13"/>
+      <v:shape id="_x0000_i1065" type="#_x0000_t75" style="width:44.5pt;height:35pt" o:bullet="t">
+        <v:imagedata r:id="rId1" o:title="Captura de pantalla 2026-06-03 a la(s) 11"/>
       </v:shape>
     </w:pict>
   </w:numPicBullet>

</xml_diff>